<commit_message>
Retain only current-market-power policy scenarios
</commit_message>
<xml_diff>
--- a/docs/05g_ag_banking_obbba_research_summary.docx
+++ b/docs/05g_ag_banking_obbba_research_summary.docx
@@ -99,7 +99,7 @@
         <w:pStyle w:val="ListBullet"/>
       </w:pPr>
       <w:r>
-        <w:t>How do results change under competitive deposit pricing, competitive agricultural-loan pricing, both markets competitive, and no bank capital constraint?</w:t>
+        <w:t>How do deposit, borrower-liquidity, default-risk, and government-credit channels operate under the market power estimated in the data?</w:t>
       </w:r>
     </w:p>
     <w:p>
@@ -425,7 +425,7 @@
         <w:t xml:space="preserve">Structural counterfactuals. </w:t>
       </w:r>
       <w:r>
-        <w:t>The model solves no policy; full OBBBA under current market power; funding-only, borrower-liquidity-only, default-only, and government-credit-only channels; alternative default assumptions; competitive deposits; competitive lending; both markets competitive; and no capital constraint.</w:t>
+        <w:t>The model solves no policy; full OBBBA under current market power; funding-only, borrower-liquidity-only, default-only, and government-credit-only channels; and alternative default assumptions.</w:t>
       </w:r>
     </w:p>
     <w:p>
@@ -436,10 +436,10 @@
         <w:rPr>
           <w:b/>
         </w:rPr>
-        <w:t xml:space="preserve">Competition restrictions. </w:t>
+        <w:t xml:space="preserve">Market-power treatment. </w:t>
       </w:r>
       <w:r>
-        <w:t>Competitive agricultural lending constrains the loan rate to risk-adjusted marginal cost. Competitive deposit pricing uses the avoided marginal wholesale funding cost net of deposit servicing and reserve carry. The current implementation uses a two-point bank-state grid and reports convergence diagnostics.</w:t>
+        <w:t>Every reported policy counterfactual retains the deposit and agricultural-loan market power estimated in the data. Competitive-pricing calibrations are excluded. The current implementation uses a two-point bank-state grid and reports convergence diagnostics.</w:t>
       </w:r>
     </w:p>
     <w:p>
@@ -574,34 +574,6 @@
       </w:r>
       <w:r>
         <w:t>For agricultural banks, the combined policy calibration reduces new agricultural loans by 6.64 percent and lowers loan rates by 14.6 basis points. For nonagricultural banks, new agricultural loans decline by 9.36 percent and the loan-rate change is approximately zero.</w:t>
-      </w:r>
-    </w:p>
-    <w:p>
-      <w:pPr>
-        <w:pStyle w:val="ListBullet"/>
-      </w:pPr>
-      <w:r>
-        <w:rPr>
-          <w:b/>
-        </w:rPr>
-        <w:t xml:space="preserve">Competitive deposit calibration. </w:t>
-      </w:r>
-      <w:r>
-        <w:t>Competitive deposit pricing raises depositor rates by roughly 138-150 basis points in the coarse model but does not materially change agricultural lending relative to the current-power OBBBA case. The additional funding is largely absorbed by securities and balance-sheet adjustments.</w:t>
-      </w:r>
-    </w:p>
-    <w:p>
-      <w:pPr>
-        <w:pStyle w:val="ListBullet"/>
-      </w:pPr>
-      <w:r>
-        <w:rPr>
-          <w:b/>
-        </w:rPr>
-        <w:t xml:space="preserve">Competitive lending calibration. </w:t>
-      </w:r>
-      <w:r>
-        <w:t>Constraining agricultural loan rates to risk-adjusted marginal cost produces much larger lending and lower loan rates: approximately +180 percent and -168 basis points for agricultural banks, and +116 percent and -91 basis points for nonagricultural banks.</w:t>
       </w:r>
     </w:p>
     <w:p>

</xml_diff>

<commit_message>
Refocus paper on farmer welfare and bank risk
</commit_message>
<xml_diff>
--- a/docs/05g_ag_banking_obbba_research_summary.docx
+++ b/docs/05g_ag_banking_obbba_research_summary.docx
@@ -14,7 +14,7 @@
           <w:color w:val="0B2545"/>
           <w:sz w:val="44"/>
         </w:rPr>
-        <w:t>Agricultural Banking and the One Big Beautiful Bill Act</w:t>
+        <w:t>How Government Farm Support Transmits Through Banks: Farmer Welfare, Bank Risk, and a Case Study of the One Big Beautiful Bill Act</w:t>
       </w:r>
     </w:p>
     <w:p>
@@ -27,7 +27,7 @@
           <w:color w:val="555555"/>
           <w:sz w:val="22"/>
         </w:rPr>
-        <w:t>Data, research questions, methods, and current results</w:t>
+        <w:t>Research framing, literature, data, methods, and current predictions</w:t>
       </w:r>
     </w:p>
     <w:p>
@@ -51,7 +51,31 @@
         <w:pStyle w:val="Heading1"/>
       </w:pPr>
       <w:r>
-        <w:t>1. Research Questions</w:t>
+        <w:t>1. Research Question and Scope</w:t>
+      </w:r>
+    </w:p>
+    <w:p>
+      <w:pPr>
+        <w:shd w:fill="EAF2F8"/>
+      </w:pPr>
+      <w:r>
+        <w:rPr>
+          <w:b/>
+        </w:rPr>
+        <w:t xml:space="preserve">Main research question. </w:t>
+      </w:r>
+      <w:r>
+        <w:t>How do government farm-support payments affect farmer welfare and bank risk when transmitted through imperfectly competitive agricultural banking markets?</w:t>
+      </w:r>
+    </w:p>
+    <w:p>
+      <w:r>
+        <w:t>Farmers and other eligible agricultural producers receive statutory support payments directly; banks are not program beneficiaries. The banking channel begins only after a payment changes borrower liquidity, deposit balances, operating-credit demand, repayment risk, or the value of government-supported credit outside commercial banks. The paper therefore asks how the initial farmer benefit is propagated, attenuated, or redistributed by the existing banking market.</w:t>
+      </w:r>
+    </w:p>
+    <w:p>
+      <w:r>
+        <w:t>We use the agricultural provisions of OBBBA as a large, plausibly measurable change in government support. We combine statutory program changes, county agricultural exposure, historical payment responses, and estimated banking-market power to evaluate the short- and long-run transmission of farm support. The OBBBA results are ex ante counterfactual predictions disciplined by historical relationships, not realized post-policy treatment effects.</w:t>
       </w:r>
     </w:p>
     <w:p>
@@ -59,7 +83,7 @@
         <w:pStyle w:val="ListBullet"/>
       </w:pPr>
       <w:r>
-        <w:t>How do OBBBA increases in ARC/PLC support and eligible base acres change government payments received in agricultural counties?</w:t>
+        <w:t>Farmer channel: Do support payments reduce costly operating-credit needs and repayment risk, or change future access to and pricing of credit?</w:t>
       </w:r>
     </w:p>
     <w:p>
@@ -67,7 +91,7 @@
         <w:pStyle w:val="ListBullet"/>
       </w:pPr>
       <w:r>
-        <w:t>How much of an increase in total FSA payments remains in local bank deposits, rather than being immediately consumed or invested?</w:t>
+        <w:t>Bank channel: Do payment-induced deposits and safer borrowers lead banks to expand agricultural lending, replace wholesale funding, purchase securities, or retain liquidity and capital?</w:t>
       </w:r>
     </w:p>
     <w:p>
@@ -75,7 +99,75 @@
         <w:pStyle w:val="ListBullet"/>
       </w:pPr>
       <w:r>
-        <w:t>How do the policy payments affect agricultural loan demand, agricultural loan rates, default risk, bank capital, and wholesale funding?</w:t>
+        <w:t>Incidence under current market power: How do estimated deposit markdowns and agricultural-loan markups shape the indirect pass-through of support that farmers initially receive?</w:t>
+      </w:r>
+    </w:p>
+    <w:p>
+      <w:pPr>
+        <w:pStyle w:val="Heading1"/>
+      </w:pPr>
+      <w:r>
+        <w:t>2. Focused Literature Review</w:t>
+      </w:r>
+    </w:p>
+    <w:p>
+      <w:pPr>
+        <w:pStyle w:val="Heading2"/>
+      </w:pPr>
+      <w:r>
+        <w:t>Government support and agricultural markets</w:t>
+      </w:r>
+    </w:p>
+    <w:p>
+      <w:r>
+        <w:t>A broad agricultural-policy literature studies how support changes production incentives, commodity marketing, prices, and expectations. Hennessy (1998) shows that income support can affect production through risk even when payments appear decoupled. Janzen, Swearingen, and Yu (2023) find that Market Facilitation Program payments allowed grain producers to delay sales and increase storage, shifting commodity supply across time. Sun's AEPP study complements this work by showing that pre-official MFP and CFAP announcements changed corn and soybean futures volatility even when official announcements had little additional effect. These studies establish that support can change expectations and real decisions before or beyond the mechanical income transfer.</w:t>
+      </w:r>
+    </w:p>
+    <w:p>
+      <w:pPr>
+        <w:pStyle w:val="Heading2"/>
+      </w:pPr>
+      <w:r>
+        <w:t>Distribution, political incidence, and use of payments</w:t>
+      </w:r>
+    </w:p>
+    <w:p>
+      <w:r>
+        <w:t>A second literature asks who receives support and how recipients use it. Giri, Subedi, and Kassel (2022) document heterogeneous MFP and CFAP payments across producer groups, while Janzen, Malone, Schaefer, and Scheitrum (2023) study the political returns to ad hoc farm payments. Research on land incidence shows that the statutory recipient need not retain the entire economic benefit: Roberts, Kirwan, and Hopkins (2003), Goodwin, Mishra, and Ortalo-Magne (2003), and Kirwan (2009) examine capitalization into land values and rents. USDA research further emphasizes that decoupled payments can raise household welfare, savings, collateral, or investment when farmers face liquidity and credit constraints. Consequently, a payment can be consumed, saved, invested, used to repay debt, or transferred to landowners; an increase in local deposits is an empirical question rather than an assumption.</w:t>
+      </w:r>
+    </w:p>
+    <w:p>
+      <w:pPr>
+        <w:pStyle w:val="Heading2"/>
+      </w:pPr>
+      <w:r>
+        <w:t>Agricultural credit, repayment risk, and banks</w:t>
+      </w:r>
+    </w:p>
+    <w:p>
+      <w:r>
+        <w:t>Agricultural-finance research links household income, collateral, and borrower risk to credit use. Key (2020) finds that greater household income relaxes credit constraints and increases farm borrowing and investment. Walraven and Barry (2003) show that commercial banks charge materially higher rates on agricultural loans they classify as riskier. Recent work directly relates ARC, PLC, MFP, and CFAP payments to non-real-estate farm debt and delinquency, finding that program effects differ across debt and delinquency horizons. This literature motivates the borrower-liquidity and default-risk channels, but it generally does not jointly model how banks reallocate deposits, wholesale funding, securities, capital, and agricultural credit.</w:t>
+      </w:r>
+    </w:p>
+    <w:p>
+      <w:pPr>
+        <w:pStyle w:val="Heading2"/>
+      </w:pPr>
+      <w:r>
+        <w:t>Financial intermediation and market power</w:t>
+      </w:r>
+    </w:p>
+    <w:p>
+      <w:r>
+        <w:t>The banking literature shows that deposit and loan market power can alter the pass-through of external shocks. Wang, Whited, Wu, and Xiao develop a dynamic bank model in which deposit market power, loan market power, capital regulation, and reserve requirements jointly determine lending responses. This project applies that intermediation logic to fiscal farm support: the government pays eligible producers, and banks subsequently choose how to price deposits and loans and allocate their balance sheets under the market power estimated in agricultural banking data.</w:t>
+      </w:r>
+    </w:p>
+    <w:p>
+      <w:pPr>
+        <w:pStyle w:val="Heading1"/>
+      </w:pPr>
+      <w:r>
+        <w:t>3. Contribution</w:t>
       </w:r>
     </w:p>
     <w:p>
@@ -83,7 +175,7 @@
         <w:pStyle w:val="ListBullet"/>
       </w:pPr>
       <w:r>
-        <w:t>Do banks convert additional deposits into agricultural loans, or do they replace wholesale funding, purchase securities, or retain liquidity?</w:t>
+        <w:t>Adds a financial-intermediation channel to research that has primarily examined commodity markets, political allocation, land incidence, and farmers' direct use of support payments.</w:t>
       </w:r>
     </w:p>
     <w:p>
@@ -91,7 +183,7 @@
         <w:pStyle w:val="ListBullet"/>
       </w:pPr>
       <w:r>
-        <w:t>How much of the policy benefit is retained by banks through deposit and agricultural-loan market power?</w:t>
+        <w:t>Separates the direct beneficiary from the indirect intermediary: farmers receive the payment, while banks respond to changes in deposits, credit demand, repayment risk, and government-credit outside options.</w:t>
       </w:r>
     </w:p>
     <w:p>
@@ -99,7 +191,7 @@
         <w:pStyle w:val="ListBullet"/>
       </w:pPr>
       <w:r>
-        <w:t>How do deposit, borrower-liquidity, default-risk, and government-credit channels operate under the market power estimated in the data?</w:t>
+        <w:t>Combines county policy exposure, historical payment-deposit and payment-credit relationships, estimated agricultural-bank market power, and a dynamic bank balance-sheet model.</w:t>
       </w:r>
     </w:p>
     <w:p>
@@ -107,7 +199,7 @@
         <w:pStyle w:val="ListBullet"/>
       </w:pPr>
       <w:r>
-        <w:t>Do higher Marketing Assistance Loan rates crowd out commercial-bank borrowing while improving farmers' access to government-supported credit?</w:t>
+        <w:t>Evaluates farmer welfare and bank risk jointly, recognizing that lower agricultural borrowing can reflect improved liquidity rather than an adverse contraction in credit supply.</w:t>
       </w:r>
     </w:p>
     <w:p>
@@ -115,7 +207,7 @@
         <w:pStyle w:val="ListBullet"/>
       </w:pPr>
       <w:r>
-        <w:t>What are the implications for farmers: lower borrowing needs, lower credit risk, cheaper credit, or redistribution of benefits toward banks?</w:t>
+        <w:t>Uses OBBBA as a forward-looking case study of a large support expansion and labels the results as predictions rather than evidence of realized post-OBBBA effects.</w:t>
       </w:r>
     </w:p>
     <w:p>
@@ -123,7 +215,7 @@
         <w:pStyle w:val="Heading1"/>
       </w:pPr>
       <w:r>
-        <w:t>2. Datasets Downloaded and Constructed</w:t>
+        <w:t>4. Datasets Downloaded and Constructed</w:t>
       </w:r>
     </w:p>
     <w:p>
@@ -271,7 +363,7 @@
         <w:pStyle w:val="Heading1"/>
       </w:pPr>
       <w:r>
-        <w:t>3. Methods</w:t>
+        <w:t>5. Methods</w:t>
       </w:r>
     </w:p>
     <w:p>
@@ -447,7 +539,7 @@
         <w:pStyle w:val="Heading1"/>
       </w:pPr>
       <w:r>
-        <w:t>4. Current Results</w:t>
+        <w:t>6. Current Predictions</w:t>
       </w:r>
     </w:p>
     <w:p>
@@ -573,21 +665,7 @@
         <w:t xml:space="preserve">Combined Bellman calibration under current market power. </w:t>
       </w:r>
       <w:r>
-        <w:t>For agricultural banks, the combined policy calibration reduces new agricultural loans by 6.64 percent and lowers loan rates by 14.6 basis points. For nonagricultural banks, new agricultural loans decline by 9.36 percent and the loan-rate change is approximately zero.</w:t>
-      </w:r>
-    </w:p>
-    <w:p>
-      <w:pPr>
-        <w:pStyle w:val="ListBullet"/>
-      </w:pPr>
-      <w:r>
-        <w:rPr>
-          <w:b/>
-        </w:rPr>
-        <w:t xml:space="preserve">Capital constraint calibration. </w:t>
-      </w:r>
-      <w:r>
-        <w:t>Removing the capital requirement produces very large lending expansions in the coarse model. This shows that capital can be quantitatively important, but the magnitude is not suitable as a headline estimate.</w:t>
+        <w:t>For agricultural banks, the combined policy calibration reduces new agricultural loans by 6.56 percent and lowers loan rates by 14.6 basis points. For nonagricultural banks, new agricultural loans decline by 9.28 percent and the loan-rate change is approximately zero.</w:t>
       </w:r>
     </w:p>
     <w:p>
@@ -616,6 +694,113 @@
       </w:r>
       <w:r>
         <w:t>The Bellman accounting identities hold to numerical precision and no solved policy violates the imposed capital constraint. However, competitor-rate fixed-point gaps remain about 0.002-0.012. The structural magnitudes are calibration results and require a finer grid, full equilibrium convergence, and valid instruments for default and outside-credit elasticities before publication.</w:t>
+      </w:r>
+    </w:p>
+    <w:p>
+      <w:pPr>
+        <w:pStyle w:val="Heading1"/>
+      </w:pPr>
+      <w:r>
+        <w:t>7. Selected References</w:t>
+      </w:r>
+    </w:p>
+    <w:p>
+      <w:pPr>
+        <w:spacing w:after="100"/>
+        <w:ind w:left="360" w:hanging="360"/>
+      </w:pPr>
+      <w:r>
+        <w:t>Giri, A. K., Subedi, D., and Kassel, K. (2022). Analysis of the payments from the Coronavirus Food Assistance Program and the Market Facilitation Program to minority producers. Applied Economic Perspectives and Policy. https://doi.org/10.1002/aepp.13325</w:t>
+      </w:r>
+    </w:p>
+    <w:p>
+      <w:pPr>
+        <w:spacing w:after="100"/>
+        <w:ind w:left="360" w:hanging="360"/>
+      </w:pPr>
+      <w:r>
+        <w:t>Goodwin, B. K., Mishra, A. K., and Ortalo-Magne, F. N. (2003). What's wrong with our models of agricultural land values? American Journal of Agricultural Economics, 85(3), 744-752. https://doi.org/10.1111/1467-8276.00479</w:t>
+      </w:r>
+    </w:p>
+    <w:p>
+      <w:pPr>
+        <w:spacing w:after="100"/>
+        <w:ind w:left="360" w:hanging="360"/>
+      </w:pPr>
+      <w:r>
+        <w:t>Hennessy, D. A. (1998). The production effects of agricultural income support policies under uncertainty. American Journal of Agricultural Economics, 80(1), 46-57.</w:t>
+      </w:r>
+    </w:p>
+    <w:p>
+      <w:pPr>
+        <w:spacing w:after="100"/>
+        <w:ind w:left="360" w:hanging="360"/>
+      </w:pPr>
+      <w:r>
+        <w:t>Janzen, J. P., Malone, T., Schaefer, K. A., and Scheitrum, D. P. (2023). Political returns to ad hoc farm payments? Applied Economic Perspectives and Policy, 45(1), 555-578. https://doi.org/10.1002/aepp.13216</w:t>
+      </w:r>
+    </w:p>
+    <w:p>
+      <w:pPr>
+        <w:spacing w:after="100"/>
+        <w:ind w:left="360" w:hanging="360"/>
+      </w:pPr>
+      <w:r>
+        <w:t>Janzen, J. P., Swearingen, B., and Yu, J. (2023). Buying time: The effect of Market Facilitation Program payments on the supply of grain storage. Journal of the Agricultural and Applied Economics Association, 2(3), 370-385. https://doi.org/10.1002/jaa2.67</w:t>
+      </w:r>
+    </w:p>
+    <w:p>
+      <w:pPr>
+        <w:spacing w:after="100"/>
+        <w:ind w:left="360" w:hanging="360"/>
+      </w:pPr>
+      <w:r>
+        <w:t>Key, N. (2020). Off-farm income, credit constraints, and farm investment. Journal of Agricultural and Applied Economics, 52(4), 642-663.</w:t>
+      </w:r>
+    </w:p>
+    <w:p>
+      <w:pPr>
+        <w:spacing w:after="100"/>
+        <w:ind w:left="360" w:hanging="360"/>
+      </w:pPr>
+      <w:r>
+        <w:t>Kirwan, B. E. (2009). The incidence of U.S. agricultural subsidies on farmland rental rates. Journal of Political Economy, 117(1), 138-164. https://doi.org/10.1086/598688</w:t>
+      </w:r>
+    </w:p>
+    <w:p>
+      <w:pPr>
+        <w:spacing w:after="100"/>
+        <w:ind w:left="360" w:hanging="360"/>
+      </w:pPr>
+      <w:r>
+        <w:t>Roberts, M. J., Kirwan, B., and Hopkins, J. (2003). The incidence of government program payments on agricultural land rents: The challenges of identification. American Journal of Agricultural Economics, 85(3), 762-769. https://doi.org/10.1111/1467-8276.00481</w:t>
+      </w:r>
+    </w:p>
+    <w:p>
+      <w:pPr>
+        <w:spacing w:after="100"/>
+        <w:ind w:left="360" w:hanging="360"/>
+      </w:pPr>
+      <w:r>
+        <w:t>Sun, Z. (manuscript). Government-support program announcements and corn and soybean futures volatility: Market Facilitation Program and Coronavirus Food Assistance Program.</w:t>
+      </w:r>
+    </w:p>
+    <w:p>
+      <w:pPr>
+        <w:spacing w:after="100"/>
+        <w:ind w:left="360" w:hanging="360"/>
+      </w:pPr>
+      <w:r>
+        <w:t>Walraven, N., and Barry, P. J. (2003). Bank risk ratings and the pricing of agricultural loans. Federal Reserve Board Finance and Economics Discussion Series.</w:t>
+      </w:r>
+    </w:p>
+    <w:p>
+      <w:pPr>
+        <w:spacing w:after="100"/>
+        <w:ind w:left="360" w:hanging="360"/>
+      </w:pPr>
+      <w:r>
+        <w:t>Wang, Y., Whited, T. M., Wu, Y., and Xiao, K. (2020). Bank market power and monetary policy transmission: Evidence from a structural estimation. SSRN 3049665.</w:t>
       </w:r>
     </w:p>
     <w:sectPr>

</xml_diff>

<commit_message>
Document four policy transmission channels
</commit_message>
<xml_diff>
--- a/docs/05g_ag_banking_obbba_research_summary.docx
+++ b/docs/05g_ag_banking_obbba_research_summary.docx
@@ -215,7 +215,163 @@
         <w:pStyle w:val="Heading1"/>
       </w:pPr>
       <w:r>
-        <w:t>4. Datasets Downloaded and Constructed</w:t>
+        <w:t>4. Four Transmission Channels and Counterfactuals</w:t>
+      </w:r>
+    </w:p>
+    <w:p>
+      <w:pPr>
+        <w:pStyle w:val="ListBullet"/>
+      </w:pPr>
+      <w:r>
+        <w:rPr>
+          <w:b/>
+        </w:rPr>
+        <w:t xml:space="preserve">B1: Deposit-funding channel. </w:t>
+      </w:r>
+      <w:r>
+        <w:t>Farm-support payments may remain temporarily in local deposits. Banks then choose whether to replace wholesale funding, expand agricultural lending, purchase securities, or retain liquidity. This channel activates the estimated deposit response while holding borrower demand, default risk, and government credit unchanged.</w:t>
+      </w:r>
+    </w:p>
+    <w:p>
+      <w:pPr>
+        <w:pStyle w:val="ListBullet"/>
+      </w:pPr>
+      <w:r>
+        <w:rPr>
+          <w:b/>
+        </w:rPr>
+        <w:t xml:space="preserve">B2: Borrower-liquidity channel. </w:t>
+      </w:r>
+      <w:r>
+        <w:t>Because farmers receive the payments directly, greater liquidity may reduce demand for short-term operating loans, permit debt repayment, finance consumption or investment internally, and improve future borrowing capacity. This channel activates the historical agricultural-loan-demand response while holding the other channels unchanged.</w:t>
+      </w:r>
+    </w:p>
+    <w:p>
+      <w:pPr>
+        <w:pStyle w:val="ListBullet"/>
+      </w:pPr>
+      <w:r>
+        <w:rPr>
+          <w:b/>
+        </w:rPr>
+        <w:t xml:space="preserve">B3: Default-risk channel. </w:t>
+      </w:r>
+      <w:r>
+        <w:t>Government support may improve repayment capacity and reduce delinquencies, charge-offs, expected loan losses, and banks' marginal lending costs. The historical regression does not causally identify this effect, so the central calibration assumes a 10 percent reduction in charge-offs and reports 0 and 25 percent sensitivity cases.</w:t>
+      </w:r>
+    </w:p>
+    <w:p>
+      <w:pPr>
+        <w:pStyle w:val="ListBullet"/>
+      </w:pPr>
+      <w:r>
+        <w:rPr>
+          <w:b/>
+        </w:rPr>
+        <w:t xml:space="preserve">B4: Government-credit channel. </w:t>
+      </w:r>
+      <w:r>
+        <w:t>Higher Marketing Assistance Loan rates improve farmers' government-supported financing option. This may improve liquidity and bargaining power while substituting for commercial operating loans. The magnitude is calibrated because the project does not yet estimate substitution between bank loans and Marketing Assistance Loans.</w:t>
+      </w:r>
+    </w:p>
+    <w:p>
+      <w:pPr>
+        <w:pStyle w:val="Heading2"/>
+      </w:pPr>
+      <w:r>
+        <w:t>Counterfactual design</w:t>
+      </w:r>
+    </w:p>
+    <w:p>
+      <w:pPr>
+        <w:pStyle w:val="ListBullet"/>
+      </w:pPr>
+      <w:r>
+        <w:rPr>
+          <w:b/>
+        </w:rPr>
+        <w:t xml:space="preserve">A_no_policy. </w:t>
+      </w:r>
+      <w:r>
+        <w:t>Baseline with all OBBBA policy shocks set to zero under current market power.</w:t>
+      </w:r>
+    </w:p>
+    <w:p>
+      <w:pPr>
+        <w:pStyle w:val="ListBullet"/>
+      </w:pPr>
+      <w:r>
+        <w:rPr>
+          <w:b/>
+        </w:rPr>
+        <w:t xml:space="preserve">B_obbba_current_market_power. </w:t>
+      </w:r>
+      <w:r>
+        <w:t>Primary counterfactual with all four channels operating simultaneously under the estimated deposit and agricultural-loan market power.</w:t>
+      </w:r>
+    </w:p>
+    <w:p>
+      <w:pPr>
+        <w:pStyle w:val="ListBullet"/>
+      </w:pPr>
+      <w:r>
+        <w:rPr>
+          <w:b/>
+        </w:rPr>
+        <w:t xml:space="preserve">B1-B4 channel decompositions. </w:t>
+      </w:r>
+      <w:r>
+        <w:t>Activate each transmission channel separately to identify which mechanism drives the full-policy prediction.</w:t>
+      </w:r>
+    </w:p>
+    <w:p>
+      <w:pPr>
+        <w:pStyle w:val="ListBullet"/>
+      </w:pPr>
+      <w:r>
+        <w:rPr>
+          <w:b/>
+        </w:rPr>
+        <w:t xml:space="preserve">B5_obbba_no_default_effect. </w:t>
+      </w:r>
+      <w:r>
+        <w:t>Full policy with no reduction in default risk.</w:t>
+      </w:r>
+    </w:p>
+    <w:p>
+      <w:pPr>
+        <w:pStyle w:val="ListBullet"/>
+      </w:pPr>
+      <w:r>
+        <w:rPr>
+          <w:b/>
+        </w:rPr>
+        <w:t xml:space="preserve">B6_obbba_chargeoffs_down_25pct. </w:t>
+      </w:r>
+      <w:r>
+        <w:t>Full policy with a stronger 25 percent charge-off reduction.</w:t>
+      </w:r>
+    </w:p>
+    <w:p>
+      <w:pPr>
+        <w:shd w:fill="F4F6F9"/>
+      </w:pPr>
+      <w:r>
+        <w:rPr>
+          <w:b/>
+        </w:rPr>
+        <w:t xml:space="preserve">Primary comparison. </w:t>
+      </w:r>
+      <w:r>
+        <w:t>B_obbba_current_market_power minus A_no_policy. B1-B4 explain the mechanisms; B5-B6 test uncertainty about default risk and are not separate government programs.</w:t>
+      </w:r>
+    </w:p>
+    <w:p>
+      <w:pPr>
+        <w:pStyle w:val="Heading1"/>
+      </w:pPr>
+      <w:r>
+        <w:t>5. Datasets Downloaded and Constructed</w:t>
       </w:r>
     </w:p>
     <w:p>
@@ -363,7 +519,7 @@
         <w:pStyle w:val="Heading1"/>
       </w:pPr>
       <w:r>
-        <w:t>5. Methods</w:t>
+        <w:t>6. Methods</w:t>
       </w:r>
     </w:p>
     <w:p>
@@ -539,7 +695,7 @@
         <w:pStyle w:val="Heading1"/>
       </w:pPr>
       <w:r>
-        <w:t>6. Current Predictions</w:t>
+        <w:t>7. Current Predictions</w:t>
       </w:r>
     </w:p>
     <w:p>
@@ -701,7 +857,7 @@
         <w:pStyle w:val="Heading1"/>
       </w:pPr>
       <w:r>
-        <w:t>7. Selected References</w:t>
+        <w:t>8. Selected References</w:t>
       </w:r>
     </w:p>
     <w:p>

</xml_diff>

<commit_message>
Update Word methods and findings
</commit_message>
<xml_diff>
--- a/docs/05g_ag_banking_obbba_research_summary.docx
+++ b/docs/05g_ag_banking_obbba_research_summary.docx
@@ -37,13 +37,7 @@
         <w:shd w:fill="F4F6F9"/>
       </w:pPr>
       <w:r>
-        <w:rPr>
-          <w:b/>
-        </w:rPr>
-        <w:t xml:space="preserve">Scope note. </w:t>
-      </w:r>
-      <w:r>
-        <w:t>The deposit and historical lending regressions are empirical estimates. The Bellman counterfactuals are coarse-grid structural calibrations, not a completed Wang-style simulated-minimum-distance estimation.</w:t>
+        <w:t>Scope note. The deposit and historical lending regressions are empirical estimates. The dynamic results now come from a corrected, two-stage simulated-minimum-distance Bellman model that passes the declared economic moment-fit gate. OBBBA effects remain ex ante predictions: the default-risk and government-credit magnitudes are calibrated sensitivity parameters rather than realized post-law treatment effects.</w:t>
       </w:r>
     </w:p>
     <w:p>
@@ -583,13 +577,7 @@
         <w:pStyle w:val="ListBullet"/>
       </w:pPr>
       <w:r>
-        <w:rPr>
-          <w:b/>
-        </w:rPr>
-        <w:t xml:space="preserve">BLP market-power estimation. </w:t>
-      </w:r>
-      <w:r>
-        <w:t>Separate differentiated-product demand systems are estimated for deposits, total loans, and agricultural production loans. Bank and year fixed effects are included; salary expense/assets and premises expense/assets serve as the primary Wang-style supply-cost instruments. Demand derivatives are combined with ownership matrices to recover markups or markdowns.</w:t>
+        <w:t>BLP market-power estimation. Separate differentiated-product demand systems are estimated for deposits, total loans, and agricultural production loans. Bank and year fixed effects are included; salary expense/assets and premises expense/assets serve as the primary Wang-style supply-cost instruments. The total-loan BLP system governs the bank's complete loan balance sheet, while the agricultural-production-loan BLP system governs the farmer-facing component and its coupon. Deposit demand governs deposit quantities and markdowns. The Bellman block retains these estimated current-market-power pricing relationships instead of re-estimating or applying market power a second time.</w:t>
       </w:r>
     </w:p>
     <w:p>
@@ -653,13 +641,7 @@
         <w:pStyle w:val="ListBullet"/>
       </w:pPr>
       <w:r>
-        <w:rPr>
-          <w:b/>
-        </w:rPr>
-        <w:t xml:space="preserve">Corrected Bellman model. </w:t>
-      </w:r>
-      <w:r>
-        <w:t>Banks choose loan rates, deposit rates, dividends, securities, reserves, and wholesale funding subject to deposit and loan demand, defaults, balance-sheet feasibility, retained earnings, reserve requirements, and capital constraints. The invalid earlier competition shortcut that multiplied demand slopes by 100 was removed.</w:t>
+        <w:t>Corrected Bellman model. The state contains the funding rate, charge-off state, farm-income state, legacy total-loan balance, and equity. In Wang's timing, the observed outstanding loan book equals L+B. Therefore legacy loans are initialized as (1-mu) times observed total loans and stationary new originations as mu times observed loans; this prevents double counting originations. Loan revenue follows Wang's present-value coupon convention, while the full book bears funding, expected-loss, and servicing costs. Deposits, reserves, securities, persistent wholesale funding, equity, taxes, dividends, and capital constraints close the balance sheet. Existing loans do not require an unobserved coupon-vintage state because Wang's replication code capitalizes the coupon stream when loans are originated.</w:t>
       </w:r>
     </w:p>
     <w:p>
@@ -667,13 +649,7 @@
         <w:pStyle w:val="ListBullet"/>
       </w:pPr>
       <w:r>
-        <w:rPr>
-          <w:b/>
-        </w:rPr>
-        <w:t xml:space="preserve">Structural counterfactuals. </w:t>
-      </w:r>
-      <w:r>
-        <w:t>The model solves no policy; full OBBBA under current market power; funding-only, borrower-liquidity-only, default-only, and government-credit-only channels; and alternative default assumptions.</w:t>
+        <w:t>Structural estimation and counterfactuals. The agricultural-bank dynamic parameters are estimated by two-stage simulated minimum distance using 43,493 bank-years from 2,984 banks. The targeted aggregate moments cover dividends/equity, wholesale funding, deposits/assets, noninterest operating cost, leverage, and loans/deposits. BLP spreads and the historical credit-funding sensitivity are retained as first-stage validation and calibration moments. Every objective evaluation re-solves the Bellman equation; the final policy functions are then used for no-policy, full OBBBA, four single-channel decompositions, and alternative default-risk scenarios.</w:t>
       </w:r>
     </w:p>
     <w:p>
@@ -681,13 +657,7 @@
         <w:pStyle w:val="ListBullet"/>
       </w:pPr>
       <w:r>
-        <w:rPr>
-          <w:b/>
-        </w:rPr>
-        <w:t xml:space="preserve">Market-power treatment. </w:t>
-      </w:r>
-      <w:r>
-        <w:t>Every reported policy counterfactual retains the deposit and agricultural-loan market power estimated in the data. Competitive-pricing calibrations are excluded. The current implementation uses a two-point bank-state grid and reports convergence diagnostics.</w:t>
+        <w:t>Numerical solution and market-power treatment. Every reported policy counterfactual retains the estimated deposit, total-loan, and agricultural-production-loan market power; no competitive-pricing scenario is reported. The model uses 360 states, bilinear continuation values over loans and equity, and empirical transition matrices for funding rates, charge-offs, and farm income. The strict estimation Bellman residual is 9.1 x 10^-9. Policy-scenario fixed-point gaps are below 5 x 10^-4, all states are feasible, and no reported policy violates the capital constraint.</w:t>
       </w:r>
     </w:p>
     <w:p>
@@ -815,13 +785,7 @@
         <w:pStyle w:val="ListBullet"/>
       </w:pPr>
       <w:r>
-        <w:rPr>
-          <w:b/>
-        </w:rPr>
-        <w:t xml:space="preserve">Combined Bellman calibration under current market power. </w:t>
-      </w:r>
-      <w:r>
-        <w:t>For agricultural banks, the combined policy calibration reduces new agricultural loans by 6.56 percent and lowers loan rates by 14.6 basis points. For nonagricultural banks, new agricultural loans decline by 9.28 percent and the loan-rate change is approximately zero.</w:t>
+        <w:t>Combined Bellman prediction under current market power. At agricultural banks, the full OBBBA scenario raises deposits by 0.132 percent, reduces new total lending by 2.35 percent, and reduces new agricultural-production lending by 10.31 percent. Wholesale funding falls by 0.067 percentage points of the model's normalized balance sheet, while securities rise by 0.418 percentage points. The total-loan rate changes by only -0.04 basis points and the agricultural-production-loan rate is unchanged on the estimated pricing grid. At nonagricultural banks, total new lending declines by 0.32 percent and agricultural-production lending declines by 9.28 percent; the balance-sheet responses are correspondingly smaller.</w:t>
       </w:r>
     </w:p>
     <w:p>
@@ -843,13 +807,7 @@
         <w:pStyle w:val="ListBullet"/>
       </w:pPr>
       <w:r>
-        <w:rPr>
-          <w:b/>
-        </w:rPr>
-        <w:t xml:space="preserve">Interpretation limitation. </w:t>
-      </w:r>
-      <w:r>
-        <w:t>The Bellman accounting identities hold to numerical precision and no solved policy violates the imposed capital constraint. However, competitor-rate fixed-point gaps remain about 0.002-0.012. The structural magnitudes are calibration results and require a finer grid, full equilibrium convergence, and valid instruments for default and outside-credit elasticities before publication.</w:t>
+        <w:t>Model fit and interpretation. The accepted model reproduces the central aggregate banking moments within the declared economic tolerances: modeled versus observed wholesale funding/deposits is 7.30 versus 6.78 percent, deposits/assets is 83.32 versus 83.60 percent, leverage is 9.44 versus 9.33, loans/deposits is 0.763 versus 0.765, and the historical credit-funding sensitivity is -11.07 versus -10.32. The predicted lending decline should not be interpreted mechanically as credit rationing: the borrower-liquidity and higher government-credit outside-option channels reduce farmers' demand for commercial operating credit. The size of the default-risk and Marketing Assistance Loan channels remains a calibrated sensitivity and should be reported separately from empirically estimated effects.</w:t>
       </w:r>
     </w:p>
     <w:p>

</xml_diff>